<commit_message>
v0.8.7: add PLN (Polish złoty) to FX conversion + match currencies
- TARGETS now includes PLN, so the receipt-dialog filter shows a PLN
  conversion/tolerance window and cross-currency matching considers PLN.
- Docs: PROJECT-DOCUMENTATION.md/.docx currency list updated to include PLN;
  status bumped to v0.8.7.

Co-Authored-By: Claude Opus 4.8 (1M context) <noreply@anthropic.com>
</commit_message>
<xml_diff>
--- a/PROJECT-DOCUMENTATION.docx
+++ b/PROJECT-DOCUMENTATION.docx
@@ -7,7 +7,7 @@
         <w:pStyle w:val="Title"/>
       </w:pPr>
       <w:r>
-        <w:t>coupa-receipt-filter — Project Documentation</w:t>
+        <w:t>Coupa Receipt Filter — Project Documentation</w:t>
       </w:r>
     </w:p>
     <w:p>
@@ -63,7 +63,7 @@
         <w:t>Receipt-dialog filter</w:t>
       </w:r>
       <w:r>
-        <w:t xml:space="preserve"> — in the "Attach a receipt" modal, converts the expense-line total into USD/EUR/COP/SGD/TRY using live FX rates and hides wallet receipts outside a ±X% tolerance window.</w:t>
+        <w:t xml:space="preserve"> — in the "Attach a receipt" modal, converts the expense-line total into USD/EUR/COP/SGD/TRY/PLN using live FX rates and hides wallet receipts outside a ±X% tolerance window.</w:t>
       </w:r>
     </w:p>
     <w:p>
@@ -207,7 +207,7 @@
         <w:t>main</w:t>
       </w:r>
       <w:r>
-        <w:t xml:space="preserve"> branch fully pushed (0 ahead / 0 behind origin), 22 commits with a steady semver progression from v0.3.1 (initial commit, Apr 2026) to v0.8.6 (latest, ~2 weeks before audit). Commit messages are descriptive and feature-scoped. The script is 1,858 lines and includes an in-app help modal that matches the implemented behavior. No obvious dead/half-finished features.</w:t>
+        <w:t xml:space="preserve"> branch fully pushed (0 ahead / 0 behind origin), steady semver progression from v0.3.1 (initial commit, Apr 2026) to v0.8.7 (latest). Commit messages are descriptive and feature-scoped. The script includes an in-app help modal that matches the implemented behavior. No obvious dead/half-finished features.</w:t>
       </w:r>
     </w:p>
     <w:p>

</xml_diff>